<commit_message>
Refactor: Remove Gmail and Google Drive integration scripts
- Deleted create_draft.py, google_tools.py, setup_google.py, upload_drive.py, and requirements.txt related to Gmail and Google Drive functionalities.
- Introduced monday.py for extracting MoM data from .docx and updating existing Monday.com CRM deals.
- Added new requirements.txt for Monday.com integration and dependencies.
- Removed unused .env.example and CLAUDE.md files.
- Cleaned up app.py and slack_app.py related to previous implementations.
</commit_message>
<xml_diff>
--- a/PTP Hackathon - Brief/MoM-Sentosa-Health-PoC-Review.docx
+++ b/PTP Hackathon - Brief/MoM-Sentosa-Health-PoC-Review.docx
@@ -498,7 +498,7 @@
                 <w:szCs w:val="20"/>
                 <w:rtl w:val="0"/>
               </w:rPr>
-              <w:t xml:space="preserve">Sentosa Health Insurance — STP  |  Stage: Waiting Confirmation  |  Value: $30,000</w:t>
+              <w:t xml:space="preserve">Sentosa Health Insurance  |  Stage: Waiting Confirmation  |  Value: $30,000</w:t>
             </w:r>
             <w:r>
               <w:rPr>
@@ -3787,7 +3787,7 @@
           <w:szCs w:val="22"/>
           <w:rtl w:val="0"/>
         </w:rPr>
-        <w:t xml:space="preserve">The following fields should be updated in Monday.com (Deal: Sentosa Health Insurance — STP):</w:t>
+        <w:t xml:space="preserve">The following fields should be updated in Monday.com (Deal: Sentosa Health Insurance):</w:t>
       </w:r>
       <w:r>
         <w:rPr>

</xml_diff>

<commit_message>
feat: Add dashboard HTML for Sales Intelligence Engine with KPI metrics, deal health monitoring, and AI actions
refactor: Simplify quotation generation logic in generate_docs.py, enhancing readability and maintainability

chore: Initialize sales_intelligence.db for database storage
</commit_message>
<xml_diff>
--- a/PTP Hackathon - Brief/MoM-Sentosa-Health-PoC-Review.docx
+++ b/PTP Hackathon - Brief/MoM-Sentosa-Health-PoC-Review.docx
@@ -40,7 +40,7 @@
           <w:szCs w:val="40"/>
           <w:rtl w:val="0"/>
         </w:rPr>
-        <w:t xml:space="preserve">Sentosa Health Insurance — PoC Review</w:t>
+        <w:t xml:space="preserve">Sentosa Health Insurance — PoC Review &amp; Commercial Discussion</w:t>
       </w:r>
       <w:r>
         <w:rPr>
@@ -147,7 +147,7 @@
                 <w:szCs w:val="20"/>
                 <w:rtl w:val="0"/>
               </w:rPr>
-              <w:t xml:space="preserve">Thursday, April 24, 2026  |  10:00 – 10:35 AM SGT</w:t>
+              <w:t xml:space="preserve">Thursday, April 24, 2026  |  10:00 – 10:40 AM SGT</w:t>
             </w:r>
             <w:r>
               <w:rPr>
@@ -313,26 +313,7 @@
                 <w:szCs w:val="20"/>
                 <w:rtl w:val="0"/>
               </w:rPr>
-              <w:t xml:space="preserve">Indi Bintang (Account Manager, Sembuh AI), </w:t>
-            </w:r>
-            <w:r>
-              <w:rPr>
-                <w:color w:val="334155"/>
-                <w:sz w:val="20"/>
-                <w:szCs w:val="20"/>
-                <w:rtl w:val="0"/>
-              </w:rPr>
-              <w:t xml:space="preserve">Yoni </w:t>
-            </w:r>
-            <w:r>
-              <w:rPr>
-                <w:rFonts w:ascii="Arial" w:cs="Arial" w:eastAsia="Arial" w:hAnsi="Arial"/>
-                <w:color w:val="334155"/>
-                <w:sz w:val="20"/>
-                <w:szCs w:val="20"/>
-                <w:rtl w:val="0"/>
-              </w:rPr>
-              <w:t xml:space="preserve"> Hartono (Head of Claims, Sentosa Health Insurance)</w:t>
+              <w:t xml:space="preserve">Indi Bintang (Account Manager, Sembuh AI), Yoni Hartono (Head of Claims, Sentosa Health Insurance)</w:t>
             </w:r>
             <w:r>
               <w:rPr>
@@ -415,7 +396,7 @@
                 <w:szCs w:val="20"/>
                 <w:rtl w:val="0"/>
               </w:rPr>
-              <w:t xml:space="preserve">PoC Review — 3-week checkpoint</w:t>
+              <w:t xml:space="preserve">PoC Review (3-week checkpoint) + Commercial Negotiation</w:t>
             </w:r>
             <w:r>
               <w:rPr>
@@ -498,7 +479,7 @@
                 <w:szCs w:val="20"/>
                 <w:rtl w:val="0"/>
               </w:rPr>
-              <w:t xml:space="preserve">Sentosa Health Insurance  |  Stage: Waiting Confirmation  |  Value: $30,000</w:t>
+              <w:t xml:space="preserve">Sentosa Health Insurance — STP  |  Stage: Waiting Confirmation  |  Value: $30,000</w:t>
             </w:r>
             <w:r>
               <w:rPr>
@@ -593,7 +574,7 @@
                 <w:szCs w:val="20"/>
                 <w:rtl w:val="0"/>
               </w:rPr>
-              <w:t xml:space="preserve"> — Client receptive, PoC meets core needs with minor adjustments. Moving toward commercial proposal.</w:t>
+              <w:t xml:space="preserve"> — Client wants to proceed. Requesting 10% discount before formal agreement. Moving to commercial proposal.</w:t>
             </w:r>
             <w:r>
               <w:rPr>
@@ -641,7 +622,7 @@
           <w:szCs w:val="22"/>
           <w:rtl w:val="0"/>
         </w:rPr>
-        <w:t xml:space="preserve">The 3-week PoC review with Sentosa Health Insurance was productive. The OCR solution is performing well on typed claim forms with near-zero errors. Handwritten form accuracy is at 70–75% and needs to reach 85–90% before production deployment — Sentosa will provide 200–300 sample forms for model fine-tuning.</w:t>
+        <w:t xml:space="preserve">The 3-week PoC review with Sentosa Health Insurance was productive and led directly into commercial discussion. The OCR solution performs well on typed claim forms with near-zero errors. Handwritten form accuracy is at 70–75% and needs to reach 85–90% — Sentosa will provide 200–300 sample forms for fine-tuning.</w:t>
       </w:r>
       <w:r>
         <w:rPr>
@@ -662,7 +643,40 @@
           <w:szCs w:val="22"/>
           <w:rtl w:val="0"/>
         </w:rPr>
-        <w:t xml:space="preserve">A workflow adjustment is required: adding an eligibility pre-check step before claims reach the assessor queue. This is a configuration change, not a rebuild. The client’s VP of Operations is the budget decision maker and needs an executive summary with PoC results and projected ROI to approve the commercial engagement.</w:t>
+        <w:t xml:space="preserve">A workflow adjustment is required: adding an eligibility pre-check step before claims reach the assessor queue. This is a configuration change, not a rebuild.</w:t>
+      </w:r>
+      <w:r>
+        <w:rPr>
+          <w:rtl w:val="0"/>
+        </w:rPr>
+      </w:r>
+    </w:p>
+    <w:p>
+      <w:pPr>
+        <w:spacing w:after="100" w:line="300" w:lineRule="auto"/>
+        <w:rPr/>
+      </w:pPr>
+      <w:r>
+        <w:rPr>
+          <w:rFonts w:ascii="Arial" w:cs="Arial" w:eastAsia="Arial" w:hAnsi="Arial"/>
+          <w:b w:val="1"/>
+          <w:bCs w:val="1"/>
+          <w:color w:val="334155"/>
+          <w:sz w:val="22"/>
+          <w:szCs w:val="22"/>
+          <w:rtl w:val="0"/>
+        </w:rPr>
+        <w:t xml:space="preserve">Key commercial development: </w:t>
+      </w:r>
+      <w:r>
+        <w:rPr>
+          <w:rFonts w:ascii="Arial" w:cs="Arial" w:eastAsia="Arial" w:hAnsi="Arial"/>
+          <w:color w:val="334155"/>
+          <w:sz w:val="22"/>
+          <w:szCs w:val="22"/>
+          <w:rtl w:val="0"/>
+        </w:rPr>
+        <w:t xml:space="preserve">Yoni Hartono confirmed Sentosa wants to move forward and formally requested a 10% discount on the proposed commercial terms, citing the scope of implementation across their full claims operation. He needs an updated quotation and a revised proposal with ROI projections to present to the VP of Operations for budget sign-off.</w:t>
       </w:r>
       <w:r>
         <w:rPr>
@@ -911,7 +925,7 @@
           <w:vertAlign w:val="baseline"/>
           <w:rtl w:val="0"/>
         </w:rPr>
-        <w:t xml:space="preserve">Diagnosis code field on handwritten forms is frequently misread. This affects auto-adjudication downstream.</w:t>
+        <w:t xml:space="preserve">Diagnosis code field on handwritten forms is frequently misread, affecting auto-adjudication downstream.</w:t>
       </w:r>
       <w:r>
         <w:rPr>
@@ -978,7 +992,7 @@
           <w:vertAlign w:val="baseline"/>
           <w:rtl w:val="0"/>
         </w:rPr>
-        <w:t xml:space="preserve">Fine-tune the model on Sentosa’s specific claim form layout using 200–300 sample forms. Client agreed to provide these within 1–2 weeks.</w:t>
+        <w:t xml:space="preserve">Fine-tune the model on Sentosa’s specific claim form layout using 200–300 sample forms. Client agreed to provide within 1–2 weeks.</w:t>
       </w:r>
       <w:r>
         <w:rPr>
@@ -1203,7 +1217,7 @@
           <w:vertAlign w:val="baseline"/>
           <w:rtl w:val="0"/>
         </w:rPr>
-        <w:t xml:space="preserve">The PoC skips the eligibility verification step. Without it, claims bypass the admin team’s pre-check, which breaks adoption.</w:t>
+        <w:t xml:space="preserve">PoC skips the eligibility verification step, breaking adoption for the admin team.</w:t>
       </w:r>
       <w:r>
         <w:rPr>
@@ -1270,7 +1284,7 @@
           <w:vertAlign w:val="baseline"/>
           <w:rtl w:val="0"/>
         </w:rPr>
-        <w:t xml:space="preserve">Add eligibility pre-check as an intermediate step. Confirmed as a configuration change — no rebuild required. Sembuh dev team to implement.</w:t>
+        <w:t xml:space="preserve">Add eligibility pre-check as intermediate step. Confirmed as configuration change — no rebuild needed.</w:t>
       </w:r>
       <w:r>
         <w:rPr>
@@ -1390,7 +1404,7 @@
           <w:vertAlign w:val="baseline"/>
           <w:rtl w:val="0"/>
         </w:rPr>
-        <w:t xml:space="preserve">Client sees high value in OCR + validation rules catching missing signatures, diagnosis codes, and supporting documents at intake — before entering the assessment queue.</w:t>
+        <w:t xml:space="preserve">OCR + validation rules catching missing signatures, diagnosis codes, and supporting documents at intake would directly reduce the 11% rejection rate (40% from incomplete docs).</w:t>
       </w:r>
       <w:r>
         <w:rPr>
@@ -1438,7 +1452,366 @@
           <w:vertAlign w:val="baseline"/>
           <w:rtl w:val="0"/>
         </w:rPr>
-        <w:t xml:space="preserve">This directly reduces the 11% rejection rate (40% of which comes from incomplete documentation).</w:t>
+        <w:t xml:space="preserve">Client sees this as a high-value feature for adoption justification.</w:t>
+      </w:r>
+      <w:r>
+        <w:rPr>
+          <w:rtl w:val="0"/>
+        </w:rPr>
+      </w:r>
+    </w:p>
+    <w:p>
+      <w:pPr>
+        <w:pStyle w:val="Heading2"/>
+        <w:spacing w:after="100" w:before="200" w:lineRule="auto"/>
+        <w:rPr/>
+      </w:pPr>
+      <w:r>
+        <w:rPr>
+          <w:rFonts w:ascii="Arial" w:cs="Arial" w:eastAsia="Arial" w:hAnsi="Arial"/>
+          <w:b w:val="1"/>
+          <w:bCs w:val="1"/>
+          <w:color w:val="0f172a"/>
+          <w:sz w:val="24"/>
+          <w:szCs w:val="24"/>
+          <w:rtl w:val="0"/>
+        </w:rPr>
+        <w:t xml:space="preserve">4. Commercial Negotiation — 10% Discount Request</w:t>
+      </w:r>
+      <w:r>
+        <w:rPr>
+          <w:rtl w:val="0"/>
+        </w:rPr>
+      </w:r>
+    </w:p>
+    <w:p>
+      <w:pPr>
+        <w:keepNext w:val="0"/>
+        <w:keepLines w:val="0"/>
+        <w:pageBreakBefore w:val="0"/>
+        <w:widowControl w:val="1"/>
+        <w:numPr>
+          <w:ilvl w:val="0"/>
+          <w:numId w:val="1"/>
+        </w:numPr>
+        <w:pBdr>
+          <w:top w:space="0" w:sz="0" w:val="nil"/>
+          <w:left w:space="0" w:sz="0" w:val="nil"/>
+          <w:bottom w:space="0" w:sz="0" w:val="nil"/>
+          <w:right w:space="0" w:sz="0" w:val="nil"/>
+          <w:between w:space="0" w:sz="0" w:val="nil"/>
+        </w:pBdr>
+        <w:shd w:fill="auto" w:val="clear"/>
+        <w:spacing w:after="60" w:before="0" w:line="280" w:lineRule="auto"/>
+        <w:ind w:left="720" w:right="0" w:hanging="360"/>
+        <w:jc w:val="left"/>
+        <w:rPr/>
+      </w:pPr>
+      <w:r>
+        <w:rPr>
+          <w:rFonts w:ascii="Arial" w:cs="Arial" w:eastAsia="Arial" w:hAnsi="Arial"/>
+          <w:b w:val="1"/>
+          <w:bCs w:val="1"/>
+          <w:i w:val="0"/>
+          <w:iCs w:val="0"/>
+          <w:smallCaps w:val="0"/>
+          <w:strike w:val="0"/>
+          <w:color w:val="334155"/>
+          <w:sz w:val="22"/>
+          <w:szCs w:val="22"/>
+          <w:u w:val="none"/>
+          <w:shd w:fill="auto" w:val="clear"/>
+          <w:vertAlign w:val="baseline"/>
+          <w:rtl w:val="0"/>
+        </w:rPr>
+        <w:t xml:space="preserve">Client intent: </w:t>
+      </w:r>
+      <w:r>
+        <w:rPr>
+          <w:rFonts w:ascii="Arial" w:cs="Arial" w:eastAsia="Arial" w:hAnsi="Arial"/>
+          <w:b w:val="0"/>
+          <w:bCs w:val="0"/>
+          <w:i w:val="0"/>
+          <w:iCs w:val="0"/>
+          <w:smallCaps w:val="0"/>
+          <w:strike w:val="0"/>
+          <w:color w:val="334155"/>
+          <w:sz w:val="22"/>
+          <w:szCs w:val="22"/>
+          <w:u w:val="none"/>
+          <w:shd w:fill="auto" w:val="clear"/>
+          <w:vertAlign w:val="baseline"/>
+          <w:rtl w:val="0"/>
+        </w:rPr>
+        <w:t xml:space="preserve">Yoni confirmed Sentosa wants to move forward with Sembuh AI. The claims team and VP of Operations have reviewed the PoC results internally and are supportive.</w:t>
+      </w:r>
+      <w:r>
+        <w:rPr>
+          <w:rtl w:val="0"/>
+        </w:rPr>
+      </w:r>
+    </w:p>
+    <w:p>
+      <w:pPr>
+        <w:keepNext w:val="0"/>
+        <w:keepLines w:val="0"/>
+        <w:pageBreakBefore w:val="0"/>
+        <w:widowControl w:val="1"/>
+        <w:numPr>
+          <w:ilvl w:val="0"/>
+          <w:numId w:val="1"/>
+        </w:numPr>
+        <w:pBdr>
+          <w:top w:space="0" w:sz="0" w:val="nil"/>
+          <w:left w:space="0" w:sz="0" w:val="nil"/>
+          <w:bottom w:space="0" w:sz="0" w:val="nil"/>
+          <w:right w:space="0" w:sz="0" w:val="nil"/>
+          <w:between w:space="0" w:sz="0" w:val="nil"/>
+        </w:pBdr>
+        <w:shd w:fill="auto" w:val="clear"/>
+        <w:spacing w:after="60" w:before="0" w:line="280" w:lineRule="auto"/>
+        <w:ind w:left="720" w:right="0" w:hanging="360"/>
+        <w:jc w:val="left"/>
+        <w:rPr/>
+      </w:pPr>
+      <w:r>
+        <w:rPr>
+          <w:rFonts w:ascii="Arial" w:cs="Arial" w:eastAsia="Arial" w:hAnsi="Arial"/>
+          <w:b w:val="1"/>
+          <w:bCs w:val="1"/>
+          <w:i w:val="0"/>
+          <w:iCs w:val="0"/>
+          <w:smallCaps w:val="0"/>
+          <w:strike w:val="0"/>
+          <w:color w:val="334155"/>
+          <w:sz w:val="22"/>
+          <w:szCs w:val="22"/>
+          <w:u w:val="none"/>
+          <w:shd w:fill="auto" w:val="clear"/>
+          <w:vertAlign w:val="baseline"/>
+          <w:rtl w:val="0"/>
+        </w:rPr>
+        <w:t xml:space="preserve">Discount request: </w:t>
+      </w:r>
+      <w:r>
+        <w:rPr>
+          <w:rFonts w:ascii="Arial" w:cs="Arial" w:eastAsia="Arial" w:hAnsi="Arial"/>
+          <w:b w:val="0"/>
+          <w:bCs w:val="0"/>
+          <w:i w:val="0"/>
+          <w:iCs w:val="0"/>
+          <w:smallCaps w:val="0"/>
+          <w:strike w:val="0"/>
+          <w:color w:val="334155"/>
+          <w:sz w:val="22"/>
+          <w:szCs w:val="22"/>
+          <w:u w:val="none"/>
+          <w:shd w:fill="auto" w:val="clear"/>
+          <w:vertAlign w:val="baseline"/>
+          <w:rtl w:val="0"/>
+        </w:rPr>
+        <w:t xml:space="preserve">Yoni formally requested a 10% discount on the proposed commercial terms. Reason: the scope covers their full claims operation (62,000 members, 4,200 claims/month) and their procurement team requires a discount for agreements of this size.</w:t>
+      </w:r>
+      <w:r>
+        <w:rPr>
+          <w:rtl w:val="0"/>
+        </w:rPr>
+      </w:r>
+    </w:p>
+    <w:p>
+      <w:pPr>
+        <w:keepNext w:val="0"/>
+        <w:keepLines w:val="0"/>
+        <w:pageBreakBefore w:val="0"/>
+        <w:widowControl w:val="1"/>
+        <w:numPr>
+          <w:ilvl w:val="0"/>
+          <w:numId w:val="1"/>
+        </w:numPr>
+        <w:pBdr>
+          <w:top w:space="0" w:sz="0" w:val="nil"/>
+          <w:left w:space="0" w:sz="0" w:val="nil"/>
+          <w:bottom w:space="0" w:sz="0" w:val="nil"/>
+          <w:right w:space="0" w:sz="0" w:val="nil"/>
+          <w:between w:space="0" w:sz="0" w:val="nil"/>
+        </w:pBdr>
+        <w:shd w:fill="auto" w:val="clear"/>
+        <w:spacing w:after="60" w:before="0" w:line="280" w:lineRule="auto"/>
+        <w:ind w:left="720" w:right="0" w:hanging="360"/>
+        <w:jc w:val="left"/>
+        <w:rPr/>
+      </w:pPr>
+      <w:r>
+        <w:rPr>
+          <w:rFonts w:ascii="Arial" w:cs="Arial" w:eastAsia="Arial" w:hAnsi="Arial"/>
+          <w:b w:val="1"/>
+          <w:bCs w:val="1"/>
+          <w:i w:val="0"/>
+          <w:iCs w:val="0"/>
+          <w:smallCaps w:val="0"/>
+          <w:strike w:val="0"/>
+          <w:color w:val="334155"/>
+          <w:sz w:val="22"/>
+          <w:szCs w:val="22"/>
+          <w:u w:val="none"/>
+          <w:shd w:fill="auto" w:val="clear"/>
+          <w:vertAlign w:val="baseline"/>
+          <w:rtl w:val="0"/>
+        </w:rPr>
+        <w:t xml:space="preserve">What Sentosa needs: </w:t>
+      </w:r>
+      <w:r>
+        <w:rPr>
+          <w:rFonts w:ascii="Arial" w:cs="Arial" w:eastAsia="Arial" w:hAnsi="Arial"/>
+          <w:b w:val="0"/>
+          <w:bCs w:val="0"/>
+          <w:i w:val="0"/>
+          <w:iCs w:val="0"/>
+          <w:smallCaps w:val="0"/>
+          <w:strike w:val="0"/>
+          <w:color w:val="334155"/>
+          <w:sz w:val="22"/>
+          <w:szCs w:val="22"/>
+          <w:u w:val="none"/>
+          <w:shd w:fill="auto" w:val="clear"/>
+          <w:vertAlign w:val="baseline"/>
+          <w:rtl w:val="0"/>
+        </w:rPr>
+        <w:t xml:space="preserve">(1) Updated quotation reflecting the 10% discount. (2) Revised proposal document with implementation timeline and ROI projections. Both needed for the VP of Operations to approve the budget.</w:t>
+      </w:r>
+      <w:r>
+        <w:rPr>
+          <w:rtl w:val="0"/>
+        </w:rPr>
+      </w:r>
+    </w:p>
+    <w:p>
+      <w:pPr>
+        <w:keepNext w:val="0"/>
+        <w:keepLines w:val="0"/>
+        <w:pageBreakBefore w:val="0"/>
+        <w:widowControl w:val="1"/>
+        <w:numPr>
+          <w:ilvl w:val="0"/>
+          <w:numId w:val="1"/>
+        </w:numPr>
+        <w:pBdr>
+          <w:top w:space="0" w:sz="0" w:val="nil"/>
+          <w:left w:space="0" w:sz="0" w:val="nil"/>
+          <w:bottom w:space="0" w:sz="0" w:val="nil"/>
+          <w:right w:space="0" w:sz="0" w:val="nil"/>
+          <w:between w:space="0" w:sz="0" w:val="nil"/>
+        </w:pBdr>
+        <w:shd w:fill="auto" w:val="clear"/>
+        <w:spacing w:after="60" w:before="0" w:line="280" w:lineRule="auto"/>
+        <w:ind w:left="720" w:right="0" w:hanging="360"/>
+        <w:jc w:val="left"/>
+        <w:rPr/>
+      </w:pPr>
+      <w:r>
+        <w:rPr>
+          <w:rFonts w:ascii="Arial" w:cs="Arial" w:eastAsia="Arial" w:hAnsi="Arial"/>
+          <w:b w:val="1"/>
+          <w:bCs w:val="1"/>
+          <w:i w:val="0"/>
+          <w:iCs w:val="0"/>
+          <w:smallCaps w:val="0"/>
+          <w:strike w:val="0"/>
+          <w:color w:val="334155"/>
+          <w:sz w:val="22"/>
+          <w:szCs w:val="22"/>
+          <w:u w:val="none"/>
+          <w:shd w:fill="auto" w:val="clear"/>
+          <w:vertAlign w:val="baseline"/>
+          <w:rtl w:val="0"/>
+        </w:rPr>
+        <w:t xml:space="preserve">Timeline: </w:t>
+      </w:r>
+      <w:r>
+        <w:rPr>
+          <w:rFonts w:ascii="Arial" w:cs="Arial" w:eastAsia="Arial" w:hAnsi="Arial"/>
+          <w:b w:val="0"/>
+          <w:bCs w:val="0"/>
+          <w:i w:val="0"/>
+          <w:iCs w:val="0"/>
+          <w:smallCaps w:val="0"/>
+          <w:strike w:val="0"/>
+          <w:color w:val="334155"/>
+          <w:sz w:val="22"/>
+          <w:szCs w:val="22"/>
+          <w:u w:val="none"/>
+          <w:shd w:fill="auto" w:val="clear"/>
+          <w:vertAlign w:val="baseline"/>
+          <w:rtl w:val="0"/>
+        </w:rPr>
+        <w:t xml:space="preserve">Yoni asked for the updated offer “at your earliest convenience.” They are targeting end of April for everything signed.</w:t>
+      </w:r>
+      <w:r>
+        <w:rPr>
+          <w:rtl w:val="0"/>
+        </w:rPr>
+      </w:r>
+    </w:p>
+    <w:p>
+      <w:pPr>
+        <w:keepNext w:val="0"/>
+        <w:keepLines w:val="0"/>
+        <w:pageBreakBefore w:val="0"/>
+        <w:widowControl w:val="1"/>
+        <w:numPr>
+          <w:ilvl w:val="0"/>
+          <w:numId w:val="1"/>
+        </w:numPr>
+        <w:pBdr>
+          <w:top w:space="0" w:sz="0" w:val="nil"/>
+          <w:left w:space="0" w:sz="0" w:val="nil"/>
+          <w:bottom w:space="0" w:sz="0" w:val="nil"/>
+          <w:right w:space="0" w:sz="0" w:val="nil"/>
+          <w:between w:space="0" w:sz="0" w:val="nil"/>
+        </w:pBdr>
+        <w:shd w:fill="auto" w:val="clear"/>
+        <w:spacing w:after="60" w:before="0" w:line="280" w:lineRule="auto"/>
+        <w:ind w:left="720" w:right="0" w:hanging="360"/>
+        <w:jc w:val="left"/>
+        <w:rPr/>
+      </w:pPr>
+      <w:r>
+        <w:rPr>
+          <w:rFonts w:ascii="Arial" w:cs="Arial" w:eastAsia="Arial" w:hAnsi="Arial"/>
+          <w:b w:val="1"/>
+          <w:bCs w:val="1"/>
+          <w:i w:val="0"/>
+          <w:iCs w:val="0"/>
+          <w:smallCaps w:val="0"/>
+          <w:strike w:val="0"/>
+          <w:color w:val="334155"/>
+          <w:sz w:val="22"/>
+          <w:szCs w:val="22"/>
+          <w:u w:val="none"/>
+          <w:shd w:fill="auto" w:val="clear"/>
+          <w:vertAlign w:val="baseline"/>
+          <w:rtl w:val="0"/>
+        </w:rPr>
+        <w:t xml:space="preserve">Sembuh response: </w:t>
+      </w:r>
+      <w:r>
+        <w:rPr>
+          <w:rFonts w:ascii="Arial" w:cs="Arial" w:eastAsia="Arial" w:hAnsi="Arial"/>
+          <w:b w:val="0"/>
+          <w:bCs w:val="0"/>
+          <w:i w:val="0"/>
+          <w:iCs w:val="0"/>
+          <w:smallCaps w:val="0"/>
+          <w:strike w:val="0"/>
+          <w:color w:val="334155"/>
+          <w:sz w:val="22"/>
+          <w:szCs w:val="22"/>
+          <w:u w:val="none"/>
+          <w:shd w:fill="auto" w:val="clear"/>
+          <w:vertAlign w:val="baseline"/>
+          <w:rtl w:val="0"/>
+        </w:rPr>
+        <w:t xml:space="preserve">Indi acknowledged the request and committed to sending the updated quotation and proposal within one week (by May 1). Will also include a 1-page executive summary for the VP.</w:t>
       </w:r>
       <w:r>
         <w:rPr>
@@ -1483,24 +1856,7 @@
           <w:szCs w:val="22"/>
           <w:rtl w:val="0"/>
         </w:rPr>
-        <w:t xml:space="preserve">The following data was shared by </w:t>
-      </w:r>
-      <w:r>
-        <w:rPr>
-          <w:color w:val="334155"/>
-          <w:rtl w:val="0"/>
-        </w:rPr>
-        <w:t xml:space="preserve">Yoni </w:t>
-      </w:r>
-      <w:r>
-        <w:rPr>
-          <w:rFonts w:ascii="Arial" w:cs="Arial" w:eastAsia="Arial" w:hAnsi="Arial"/>
-          <w:color w:val="334155"/>
-          <w:sz w:val="22"/>
-          <w:szCs w:val="22"/>
-          <w:rtl w:val="0"/>
-        </w:rPr>
-        <w:t xml:space="preserve"> Hartono for commercial proposal scoping:</w:t>
+        <w:t xml:space="preserve">Data shared by Yoni Hartono for commercial proposal scoping:</w:t>
       </w:r>
       <w:r>
         <w:rPr>
@@ -2043,6 +2399,172 @@
           </w:p>
         </w:tc>
       </w:tr>
+      <w:tr>
+        <w:trPr>
+          <w:cantSplit w:val="0"/>
+          <w:tblHeader w:val="0"/>
+        </w:trPr>
+        <w:tc>
+          <w:tcPr>
+            <w:tcBorders>
+              <w:top w:color="cbd5e1" w:space="0" w:sz="4" w:val="single"/>
+              <w:left w:color="cbd5e1" w:space="0" w:sz="4" w:val="single"/>
+              <w:bottom w:color="cbd5e1" w:space="0" w:sz="4" w:val="single"/>
+              <w:right w:color="cbd5e1" w:space="0" w:sz="4" w:val="single"/>
+            </w:tcBorders>
+            <w:shd w:fill="f8fafc" w:val="clear"/>
+            <w:tcMar>
+              <w:top w:w="80.0" w:type="dxa"/>
+              <w:left w:w="120.0" w:type="dxa"/>
+              <w:bottom w:w="80.0" w:type="dxa"/>
+              <w:right w:w="120.0" w:type="dxa"/>
+            </w:tcMar>
+          </w:tcPr>
+          <w:p>
+            <w:pPr>
+              <w:spacing w:line="280" w:lineRule="auto"/>
+              <w:rPr/>
+            </w:pPr>
+            <w:r>
+              <w:rPr>
+                <w:rFonts w:ascii="Arial" w:cs="Arial" w:eastAsia="Arial" w:hAnsi="Arial"/>
+                <w:b w:val="1"/>
+                <w:bCs w:val="1"/>
+                <w:color w:val="334155"/>
+                <w:sz w:val="20"/>
+                <w:szCs w:val="20"/>
+                <w:rtl w:val="0"/>
+              </w:rPr>
+              <w:t xml:space="preserve">Discount Requested</w:t>
+            </w:r>
+            <w:r>
+              <w:rPr>
+                <w:rtl w:val="0"/>
+              </w:rPr>
+            </w:r>
+          </w:p>
+        </w:tc>
+        <w:tc>
+          <w:tcPr>
+            <w:tcBorders>
+              <w:top w:color="cbd5e1" w:space="0" w:sz="4" w:val="single"/>
+              <w:left w:color="cbd5e1" w:space="0" w:sz="4" w:val="single"/>
+              <w:bottom w:color="cbd5e1" w:space="0" w:sz="4" w:val="single"/>
+              <w:right w:color="cbd5e1" w:space="0" w:sz="4" w:val="single"/>
+            </w:tcBorders>
+            <w:shd w:fill="f8fafc" w:val="clear"/>
+            <w:tcMar>
+              <w:top w:w="80.0" w:type="dxa"/>
+              <w:left w:w="120.0" w:type="dxa"/>
+              <w:bottom w:w="80.0" w:type="dxa"/>
+              <w:right w:w="120.0" w:type="dxa"/>
+            </w:tcMar>
+          </w:tcPr>
+          <w:p>
+            <w:pPr>
+              <w:spacing w:line="280" w:lineRule="auto"/>
+              <w:rPr/>
+            </w:pPr>
+            <w:r>
+              <w:rPr>
+                <w:rFonts w:ascii="Arial" w:cs="Arial" w:eastAsia="Arial" w:hAnsi="Arial"/>
+                <w:color w:val="334155"/>
+                <w:sz w:val="20"/>
+                <w:szCs w:val="20"/>
+                <w:rtl w:val="0"/>
+              </w:rPr>
+              <w:t xml:space="preserve">10% on all commercial terms (per procurement requirement)</w:t>
+            </w:r>
+            <w:r>
+              <w:rPr>
+                <w:rtl w:val="0"/>
+              </w:rPr>
+            </w:r>
+          </w:p>
+        </w:tc>
+      </w:tr>
+      <w:tr>
+        <w:trPr>
+          <w:cantSplit w:val="0"/>
+          <w:tblHeader w:val="0"/>
+        </w:trPr>
+        <w:tc>
+          <w:tcPr>
+            <w:tcBorders>
+              <w:top w:color="cbd5e1" w:space="0" w:sz="4" w:val="single"/>
+              <w:left w:color="cbd5e1" w:space="0" w:sz="4" w:val="single"/>
+              <w:bottom w:color="cbd5e1" w:space="0" w:sz="4" w:val="single"/>
+              <w:right w:color="cbd5e1" w:space="0" w:sz="4" w:val="single"/>
+            </w:tcBorders>
+            <w:tcMar>
+              <w:top w:w="80.0" w:type="dxa"/>
+              <w:left w:w="120.0" w:type="dxa"/>
+              <w:bottom w:w="80.0" w:type="dxa"/>
+              <w:right w:w="120.0" w:type="dxa"/>
+            </w:tcMar>
+          </w:tcPr>
+          <w:p>
+            <w:pPr>
+              <w:spacing w:line="280" w:lineRule="auto"/>
+              <w:rPr/>
+            </w:pPr>
+            <w:r>
+              <w:rPr>
+                <w:rFonts w:ascii="Arial" w:cs="Arial" w:eastAsia="Arial" w:hAnsi="Arial"/>
+                <w:b w:val="1"/>
+                <w:bCs w:val="1"/>
+                <w:color w:val="334155"/>
+                <w:sz w:val="20"/>
+                <w:szCs w:val="20"/>
+                <w:rtl w:val="0"/>
+              </w:rPr>
+              <w:t xml:space="preserve">Target Close Date</w:t>
+            </w:r>
+            <w:r>
+              <w:rPr>
+                <w:rtl w:val="0"/>
+              </w:rPr>
+            </w:r>
+          </w:p>
+        </w:tc>
+        <w:tc>
+          <w:tcPr>
+            <w:tcBorders>
+              <w:top w:color="cbd5e1" w:space="0" w:sz="4" w:val="single"/>
+              <w:left w:color="cbd5e1" w:space="0" w:sz="4" w:val="single"/>
+              <w:bottom w:color="cbd5e1" w:space="0" w:sz="4" w:val="single"/>
+              <w:right w:color="cbd5e1" w:space="0" w:sz="4" w:val="single"/>
+            </w:tcBorders>
+            <w:tcMar>
+              <w:top w:w="80.0" w:type="dxa"/>
+              <w:left w:w="120.0" w:type="dxa"/>
+              <w:bottom w:w="80.0" w:type="dxa"/>
+              <w:right w:w="120.0" w:type="dxa"/>
+            </w:tcMar>
+          </w:tcPr>
+          <w:p>
+            <w:pPr>
+              <w:spacing w:line="280" w:lineRule="auto"/>
+              <w:rPr/>
+            </w:pPr>
+            <w:r>
+              <w:rPr>
+                <w:rFonts w:ascii="Arial" w:cs="Arial" w:eastAsia="Arial" w:hAnsi="Arial"/>
+                <w:color w:val="334155"/>
+                <w:sz w:val="20"/>
+                <w:szCs w:val="20"/>
+                <w:rtl w:val="0"/>
+              </w:rPr>
+              <w:t xml:space="preserve">End of April 2026</w:t>
+            </w:r>
+            <w:r>
+              <w:rPr>
+                <w:rtl w:val="0"/>
+              </w:rPr>
+            </w:r>
+          </w:p>
+        </w:tc>
+      </w:tr>
     </w:tbl>
     <w:p>
       <w:pPr>
@@ -2097,17 +2619,17 @@
       </w:tblPr>
       <w:tblGrid>
         <w:gridCol w:w="500"/>
-        <w:gridCol w:w="3600"/>
+        <w:gridCol w:w="3200"/>
         <w:gridCol w:w="2200"/>
         <w:gridCol w:w="1560"/>
-        <w:gridCol w:w="1500"/>
+        <w:gridCol w:w="1900"/>
         <w:tblGridChange w:id="0">
           <w:tblGrid>
             <w:gridCol w:w="500"/>
-            <w:gridCol w:w="3600"/>
+            <w:gridCol w:w="3200"/>
             <w:gridCol w:w="2200"/>
             <w:gridCol w:w="1560"/>
-            <w:gridCol w:w="1500"/>
+            <w:gridCol w:w="1900"/>
           </w:tblGrid>
         </w:tblGridChange>
       </w:tblGrid>
@@ -2384,81 +2906,81 @@
                 <w:szCs w:val="20"/>
                 <w:rtl w:val="0"/>
               </w:rPr>
-              <w:t xml:space="preserve">Add eligibility pre-check step to PoC workflow</w:t>
-            </w:r>
-            <w:r>
-              <w:rPr>
-                <w:rtl w:val="0"/>
-              </w:rPr>
-            </w:r>
-          </w:p>
-        </w:tc>
-        <w:tc>
-          <w:tcPr>
-            <w:tcBorders>
-              <w:top w:color="cbd5e1" w:space="0" w:sz="4" w:val="single"/>
-              <w:left w:color="cbd5e1" w:space="0" w:sz="4" w:val="single"/>
-              <w:bottom w:color="cbd5e1" w:space="0" w:sz="4" w:val="single"/>
-              <w:right w:color="cbd5e1" w:space="0" w:sz="4" w:val="single"/>
-            </w:tcBorders>
-            <w:tcMar>
-              <w:top w:w="80.0" w:type="dxa"/>
-              <w:left w:w="120.0" w:type="dxa"/>
-              <w:bottom w:w="80.0" w:type="dxa"/>
-              <w:right w:w="120.0" w:type="dxa"/>
-            </w:tcMar>
-          </w:tcPr>
-          <w:p>
-            <w:pPr>
-              <w:spacing w:line="280" w:lineRule="auto"/>
-              <w:rPr/>
-            </w:pPr>
-            <w:r>
-              <w:rPr>
-                <w:rFonts w:ascii="Arial" w:cs="Arial" w:eastAsia="Arial" w:hAnsi="Arial"/>
-                <w:color w:val="334155"/>
-                <w:sz w:val="20"/>
-                <w:szCs w:val="20"/>
-                <w:rtl w:val="0"/>
-              </w:rPr>
-              <w:t xml:space="preserve">Sembuh AI (Dev Team)</w:t>
-            </w:r>
-            <w:r>
-              <w:rPr>
-                <w:rtl w:val="0"/>
-              </w:rPr>
-            </w:r>
-          </w:p>
-        </w:tc>
-        <w:tc>
-          <w:tcPr>
-            <w:tcBorders>
-              <w:top w:color="cbd5e1" w:space="0" w:sz="4" w:val="single"/>
-              <w:left w:color="cbd5e1" w:space="0" w:sz="4" w:val="single"/>
-              <w:bottom w:color="cbd5e1" w:space="0" w:sz="4" w:val="single"/>
-              <w:right w:color="cbd5e1" w:space="0" w:sz="4" w:val="single"/>
-            </w:tcBorders>
-            <w:tcMar>
-              <w:top w:w="80.0" w:type="dxa"/>
-              <w:left w:w="120.0" w:type="dxa"/>
-              <w:bottom w:w="80.0" w:type="dxa"/>
-              <w:right w:w="120.0" w:type="dxa"/>
-            </w:tcMar>
-          </w:tcPr>
-          <w:p>
-            <w:pPr>
-              <w:spacing w:line="280" w:lineRule="auto"/>
-              <w:rPr/>
-            </w:pPr>
-            <w:r>
-              <w:rPr>
-                <w:rFonts w:ascii="Arial" w:cs="Arial" w:eastAsia="Arial" w:hAnsi="Arial"/>
-                <w:color w:val="334155"/>
-                <w:sz w:val="20"/>
-                <w:szCs w:val="20"/>
-                <w:rtl w:val="0"/>
-              </w:rPr>
-              <w:t xml:space="preserve">Before next iteration</w:t>
+              <w:t xml:space="preserve">Send updated quotation with 10% discount applied</w:t>
+            </w:r>
+            <w:r>
+              <w:rPr>
+                <w:rtl w:val="0"/>
+              </w:rPr>
+            </w:r>
+          </w:p>
+        </w:tc>
+        <w:tc>
+          <w:tcPr>
+            <w:tcBorders>
+              <w:top w:color="cbd5e1" w:space="0" w:sz="4" w:val="single"/>
+              <w:left w:color="cbd5e1" w:space="0" w:sz="4" w:val="single"/>
+              <w:bottom w:color="cbd5e1" w:space="0" w:sz="4" w:val="single"/>
+              <w:right w:color="cbd5e1" w:space="0" w:sz="4" w:val="single"/>
+            </w:tcBorders>
+            <w:tcMar>
+              <w:top w:w="80.0" w:type="dxa"/>
+              <w:left w:w="120.0" w:type="dxa"/>
+              <w:bottom w:w="80.0" w:type="dxa"/>
+              <w:right w:w="120.0" w:type="dxa"/>
+            </w:tcMar>
+          </w:tcPr>
+          <w:p>
+            <w:pPr>
+              <w:spacing w:line="280" w:lineRule="auto"/>
+              <w:rPr/>
+            </w:pPr>
+            <w:r>
+              <w:rPr>
+                <w:rFonts w:ascii="Arial" w:cs="Arial" w:eastAsia="Arial" w:hAnsi="Arial"/>
+                <w:color w:val="334155"/>
+                <w:sz w:val="20"/>
+                <w:szCs w:val="20"/>
+                <w:rtl w:val="0"/>
+              </w:rPr>
+              <w:t xml:space="preserve">Indi Bintang</w:t>
+            </w:r>
+            <w:r>
+              <w:rPr>
+                <w:rtl w:val="0"/>
+              </w:rPr>
+            </w:r>
+          </w:p>
+        </w:tc>
+        <w:tc>
+          <w:tcPr>
+            <w:tcBorders>
+              <w:top w:color="cbd5e1" w:space="0" w:sz="4" w:val="single"/>
+              <w:left w:color="cbd5e1" w:space="0" w:sz="4" w:val="single"/>
+              <w:bottom w:color="cbd5e1" w:space="0" w:sz="4" w:val="single"/>
+              <w:right w:color="cbd5e1" w:space="0" w:sz="4" w:val="single"/>
+            </w:tcBorders>
+            <w:tcMar>
+              <w:top w:w="80.0" w:type="dxa"/>
+              <w:left w:w="120.0" w:type="dxa"/>
+              <w:bottom w:w="80.0" w:type="dxa"/>
+              <w:right w:w="120.0" w:type="dxa"/>
+            </w:tcMar>
+          </w:tcPr>
+          <w:p>
+            <w:pPr>
+              <w:spacing w:line="280" w:lineRule="auto"/>
+              <w:rPr/>
+            </w:pPr>
+            <w:r>
+              <w:rPr>
+                <w:rFonts w:ascii="Arial" w:cs="Arial" w:eastAsia="Arial" w:hAnsi="Arial"/>
+                <w:color w:val="334155"/>
+                <w:sz w:val="20"/>
+                <w:szCs w:val="20"/>
+                <w:rtl w:val="0"/>
+              </w:rPr>
+              <w:t xml:space="preserve">May 1, 2026</w:t>
             </w:r>
             <w:r>
               <w:rPr>
@@ -2581,7 +3103,7 @@
                 <w:szCs w:val="20"/>
                 <w:rtl w:val="0"/>
               </w:rPr>
-              <w:t xml:space="preserve">Prepare commercial proposal with scoped pricing</w:t>
+              <w:t xml:space="preserve">Send revised proposal with ROI projections + implementation timeline</w:t>
             </w:r>
             <w:r>
               <w:rPr>
@@ -2777,7 +3299,7 @@
                 <w:szCs w:val="20"/>
                 <w:rtl w:val="0"/>
               </w:rPr>
-              <w:t xml:space="preserve">Prepare 1-page executive summary (PoC results + ROI projection)</w:t>
+              <w:t xml:space="preserve">Prepare 1-page executive summary (PoC results + ROI) for VP</w:t>
             </w:r>
             <w:r>
               <w:rPr>
@@ -2972,7 +3494,7 @@
                 <w:szCs w:val="20"/>
                 <w:rtl w:val="0"/>
               </w:rPr>
-              <w:t xml:space="preserve">Provide 200–300 sample handwritten claim forms for OCR fine-tuning</w:t>
+              <w:t xml:space="preserve">Add eligibility pre-check step to PoC workflow</w:t>
             </w:r>
             <w:r>
               <w:rPr>
@@ -3004,22 +3526,13 @@
             </w:pPr>
             <w:r>
               <w:rPr>
-                <w:color w:val="334155"/>
-                <w:sz w:val="20"/>
-                <w:szCs w:val="20"/>
-                <w:rtl w:val="0"/>
-              </w:rPr>
-              <w:t xml:space="preserve">Yoni </w:t>
-            </w:r>
-            <w:r>
-              <w:rPr>
-                <w:rFonts w:ascii="Arial" w:cs="Arial" w:eastAsia="Arial" w:hAnsi="Arial"/>
-                <w:color w:val="334155"/>
-                <w:sz w:val="20"/>
-                <w:szCs w:val="20"/>
-                <w:rtl w:val="0"/>
-              </w:rPr>
-              <w:t xml:space="preserve"> Hartono (Sentosa)</w:t>
+                <w:rFonts w:ascii="Arial" w:cs="Arial" w:eastAsia="Arial" w:hAnsi="Arial"/>
+                <w:color w:val="334155"/>
+                <w:sz w:val="20"/>
+                <w:szCs w:val="20"/>
+                <w:rtl w:val="0"/>
+              </w:rPr>
+              <w:t xml:space="preserve">Sembuh AI (Dev Team)</w:t>
             </w:r>
             <w:r>
               <w:rPr>
@@ -3057,7 +3570,7 @@
                 <w:szCs w:val="20"/>
                 <w:rtl w:val="0"/>
               </w:rPr>
-              <w:t xml:space="preserve">May 7, 2026</w:t>
+              <w:t xml:space="preserve">Before go-live</w:t>
             </w:r>
             <w:r>
               <w:rPr>
@@ -3092,12 +3605,12 @@
                 <w:rFonts w:ascii="Arial" w:cs="Arial" w:eastAsia="Arial" w:hAnsi="Arial"/>
                 <w:b w:val="1"/>
                 <w:bCs w:val="1"/>
-                <w:color w:val="d97706"/>
-                <w:sz w:val="20"/>
-                <w:szCs w:val="20"/>
-                <w:rtl w:val="0"/>
-              </w:rPr>
-              <w:t xml:space="preserve">WAITING</w:t>
+                <w:color w:val="dc2626"/>
+                <w:sz w:val="20"/>
+                <w:szCs w:val="20"/>
+                <w:rtl w:val="0"/>
+              </w:rPr>
+              <w:t xml:space="preserve">TO DO</w:t>
             </w:r>
             <w:r>
               <w:rPr>
@@ -3177,6 +3690,201 @@
                 <w:szCs w:val="20"/>
                 <w:rtl w:val="0"/>
               </w:rPr>
+              <w:t xml:space="preserve">Provide 200–300 sample handwritten claim forms for OCR fine-tuning</w:t>
+            </w:r>
+            <w:r>
+              <w:rPr>
+                <w:rtl w:val="0"/>
+              </w:rPr>
+            </w:r>
+          </w:p>
+        </w:tc>
+        <w:tc>
+          <w:tcPr>
+            <w:tcBorders>
+              <w:top w:color="cbd5e1" w:space="0" w:sz="4" w:val="single"/>
+              <w:left w:color="cbd5e1" w:space="0" w:sz="4" w:val="single"/>
+              <w:bottom w:color="cbd5e1" w:space="0" w:sz="4" w:val="single"/>
+              <w:right w:color="cbd5e1" w:space="0" w:sz="4" w:val="single"/>
+            </w:tcBorders>
+            <w:tcMar>
+              <w:top w:w="80.0" w:type="dxa"/>
+              <w:left w:w="120.0" w:type="dxa"/>
+              <w:bottom w:w="80.0" w:type="dxa"/>
+              <w:right w:w="120.0" w:type="dxa"/>
+            </w:tcMar>
+          </w:tcPr>
+          <w:p>
+            <w:pPr>
+              <w:spacing w:line="280" w:lineRule="auto"/>
+              <w:rPr/>
+            </w:pPr>
+            <w:r>
+              <w:rPr>
+                <w:rFonts w:ascii="Arial" w:cs="Arial" w:eastAsia="Arial" w:hAnsi="Arial"/>
+                <w:color w:val="334155"/>
+                <w:sz w:val="20"/>
+                <w:szCs w:val="20"/>
+                <w:rtl w:val="0"/>
+              </w:rPr>
+              <w:t xml:space="preserve">Yoni Hartono (Sentosa)</w:t>
+            </w:r>
+            <w:r>
+              <w:rPr>
+                <w:rtl w:val="0"/>
+              </w:rPr>
+            </w:r>
+          </w:p>
+        </w:tc>
+        <w:tc>
+          <w:tcPr>
+            <w:tcBorders>
+              <w:top w:color="cbd5e1" w:space="0" w:sz="4" w:val="single"/>
+              <w:left w:color="cbd5e1" w:space="0" w:sz="4" w:val="single"/>
+              <w:bottom w:color="cbd5e1" w:space="0" w:sz="4" w:val="single"/>
+              <w:right w:color="cbd5e1" w:space="0" w:sz="4" w:val="single"/>
+            </w:tcBorders>
+            <w:tcMar>
+              <w:top w:w="80.0" w:type="dxa"/>
+              <w:left w:w="120.0" w:type="dxa"/>
+              <w:bottom w:w="80.0" w:type="dxa"/>
+              <w:right w:w="120.0" w:type="dxa"/>
+            </w:tcMar>
+          </w:tcPr>
+          <w:p>
+            <w:pPr>
+              <w:spacing w:line="280" w:lineRule="auto"/>
+              <w:rPr/>
+            </w:pPr>
+            <w:r>
+              <w:rPr>
+                <w:rFonts w:ascii="Arial" w:cs="Arial" w:eastAsia="Arial" w:hAnsi="Arial"/>
+                <w:color w:val="334155"/>
+                <w:sz w:val="20"/>
+                <w:szCs w:val="20"/>
+                <w:rtl w:val="0"/>
+              </w:rPr>
+              <w:t xml:space="preserve">May 7, 2026</w:t>
+            </w:r>
+            <w:r>
+              <w:rPr>
+                <w:rtl w:val="0"/>
+              </w:rPr>
+            </w:r>
+          </w:p>
+        </w:tc>
+        <w:tc>
+          <w:tcPr>
+            <w:tcBorders>
+              <w:top w:color="cbd5e1" w:space="0" w:sz="4" w:val="single"/>
+              <w:left w:color="cbd5e1" w:space="0" w:sz="4" w:val="single"/>
+              <w:bottom w:color="cbd5e1" w:space="0" w:sz="4" w:val="single"/>
+              <w:right w:color="cbd5e1" w:space="0" w:sz="4" w:val="single"/>
+            </w:tcBorders>
+            <w:tcMar>
+              <w:top w:w="80.0" w:type="dxa"/>
+              <w:left w:w="120.0" w:type="dxa"/>
+              <w:bottom w:w="80.0" w:type="dxa"/>
+              <w:right w:w="120.0" w:type="dxa"/>
+            </w:tcMar>
+          </w:tcPr>
+          <w:p>
+            <w:pPr>
+              <w:spacing w:line="280" w:lineRule="auto"/>
+              <w:rPr/>
+            </w:pPr>
+            <w:r>
+              <w:rPr>
+                <w:rFonts w:ascii="Arial" w:cs="Arial" w:eastAsia="Arial" w:hAnsi="Arial"/>
+                <w:b w:val="1"/>
+                <w:bCs w:val="1"/>
+                <w:color w:val="d97706"/>
+                <w:sz w:val="20"/>
+                <w:szCs w:val="20"/>
+                <w:rtl w:val="0"/>
+              </w:rPr>
+              <w:t xml:space="preserve">WAITING</w:t>
+            </w:r>
+            <w:r>
+              <w:rPr>
+                <w:rtl w:val="0"/>
+              </w:rPr>
+            </w:r>
+          </w:p>
+        </w:tc>
+      </w:tr>
+      <w:tr>
+        <w:trPr>
+          <w:cantSplit w:val="0"/>
+          <w:tblHeader w:val="0"/>
+        </w:trPr>
+        <w:tc>
+          <w:tcPr>
+            <w:tcBorders>
+              <w:top w:color="cbd5e1" w:space="0" w:sz="4" w:val="single"/>
+              <w:left w:color="cbd5e1" w:space="0" w:sz="4" w:val="single"/>
+              <w:bottom w:color="cbd5e1" w:space="0" w:sz="4" w:val="single"/>
+              <w:right w:color="cbd5e1" w:space="0" w:sz="4" w:val="single"/>
+            </w:tcBorders>
+            <w:shd w:fill="f8fafc" w:val="clear"/>
+            <w:tcMar>
+              <w:top w:w="80.0" w:type="dxa"/>
+              <w:left w:w="120.0" w:type="dxa"/>
+              <w:bottom w:w="80.0" w:type="dxa"/>
+              <w:right w:w="120.0" w:type="dxa"/>
+            </w:tcMar>
+          </w:tcPr>
+          <w:p>
+            <w:pPr>
+              <w:spacing w:line="280" w:lineRule="auto"/>
+              <w:rPr/>
+            </w:pPr>
+            <w:r>
+              <w:rPr>
+                <w:rFonts w:ascii="Arial" w:cs="Arial" w:eastAsia="Arial" w:hAnsi="Arial"/>
+                <w:color w:val="334155"/>
+                <w:sz w:val="20"/>
+                <w:szCs w:val="20"/>
+                <w:rtl w:val="0"/>
+              </w:rPr>
+              <w:t xml:space="preserve">6</w:t>
+            </w:r>
+            <w:r>
+              <w:rPr>
+                <w:rtl w:val="0"/>
+              </w:rPr>
+            </w:r>
+          </w:p>
+        </w:tc>
+        <w:tc>
+          <w:tcPr>
+            <w:tcBorders>
+              <w:top w:color="cbd5e1" w:space="0" w:sz="4" w:val="single"/>
+              <w:left w:color="cbd5e1" w:space="0" w:sz="4" w:val="single"/>
+              <w:bottom w:color="cbd5e1" w:space="0" w:sz="4" w:val="single"/>
+              <w:right w:color="cbd5e1" w:space="0" w:sz="4" w:val="single"/>
+            </w:tcBorders>
+            <w:shd w:fill="f8fafc" w:val="clear"/>
+            <w:tcMar>
+              <w:top w:w="80.0" w:type="dxa"/>
+              <w:left w:w="120.0" w:type="dxa"/>
+              <w:bottom w:w="80.0" w:type="dxa"/>
+              <w:right w:w="120.0" w:type="dxa"/>
+            </w:tcMar>
+          </w:tcPr>
+          <w:p>
+            <w:pPr>
+              <w:spacing w:line="280" w:lineRule="auto"/>
+              <w:rPr/>
+            </w:pPr>
+            <w:r>
+              <w:rPr>
+                <w:rFonts w:ascii="Arial" w:cs="Arial" w:eastAsia="Arial" w:hAnsi="Arial"/>
+                <w:color w:val="334155"/>
+                <w:sz w:val="20"/>
+                <w:szCs w:val="20"/>
+                <w:rtl w:val="0"/>
+              </w:rPr>
               <w:t xml:space="preserve">Fine-tune handwriting OCR model on Sentosa form layout</w:t>
             </w:r>
             <w:r>
@@ -3194,6 +3902,7 @@
               <w:bottom w:color="cbd5e1" w:space="0" w:sz="4" w:val="single"/>
               <w:right w:color="cbd5e1" w:space="0" w:sz="4" w:val="single"/>
             </w:tcBorders>
+            <w:shd w:fill="f8fafc" w:val="clear"/>
             <w:tcMar>
               <w:top w:w="80.0" w:type="dxa"/>
               <w:left w:w="120.0" w:type="dxa"/>
@@ -3231,43 +3940,45 @@
               <w:bottom w:color="cbd5e1" w:space="0" w:sz="4" w:val="single"/>
               <w:right w:color="cbd5e1" w:space="0" w:sz="4" w:val="single"/>
             </w:tcBorders>
-            <w:tcMar>
-              <w:top w:w="80.0" w:type="dxa"/>
-              <w:left w:w="120.0" w:type="dxa"/>
-              <w:bottom w:w="80.0" w:type="dxa"/>
-              <w:right w:w="120.0" w:type="dxa"/>
-            </w:tcMar>
-          </w:tcPr>
-          <w:p>
-            <w:pPr>
-              <w:spacing w:line="280" w:lineRule="auto"/>
-              <w:rPr/>
-            </w:pPr>
-            <w:r>
-              <w:rPr>
-                <w:rFonts w:ascii="Arial" w:cs="Arial" w:eastAsia="Arial" w:hAnsi="Arial"/>
-                <w:color w:val="334155"/>
-                <w:sz w:val="20"/>
-                <w:szCs w:val="20"/>
-                <w:rtl w:val="0"/>
-              </w:rPr>
-              <w:t xml:space="preserve">After #4 received</w:t>
-            </w:r>
-            <w:r>
-              <w:rPr>
-                <w:rtl w:val="0"/>
-              </w:rPr>
-            </w:r>
-          </w:p>
-        </w:tc>
-        <w:tc>
-          <w:tcPr>
-            <w:tcBorders>
-              <w:top w:color="cbd5e1" w:space="0" w:sz="4" w:val="single"/>
-              <w:left w:color="cbd5e1" w:space="0" w:sz="4" w:val="single"/>
-              <w:bottom w:color="cbd5e1" w:space="0" w:sz="4" w:val="single"/>
-              <w:right w:color="cbd5e1" w:space="0" w:sz="4" w:val="single"/>
-            </w:tcBorders>
+            <w:shd w:fill="f8fafc" w:val="clear"/>
+            <w:tcMar>
+              <w:top w:w="80.0" w:type="dxa"/>
+              <w:left w:w="120.0" w:type="dxa"/>
+              <w:bottom w:w="80.0" w:type="dxa"/>
+              <w:right w:w="120.0" w:type="dxa"/>
+            </w:tcMar>
+          </w:tcPr>
+          <w:p>
+            <w:pPr>
+              <w:spacing w:line="280" w:lineRule="auto"/>
+              <w:rPr/>
+            </w:pPr>
+            <w:r>
+              <w:rPr>
+                <w:rFonts w:ascii="Arial" w:cs="Arial" w:eastAsia="Arial" w:hAnsi="Arial"/>
+                <w:color w:val="334155"/>
+                <w:sz w:val="20"/>
+                <w:szCs w:val="20"/>
+                <w:rtl w:val="0"/>
+              </w:rPr>
+              <w:t xml:space="preserve">After #5</w:t>
+            </w:r>
+            <w:r>
+              <w:rPr>
+                <w:rtl w:val="0"/>
+              </w:rPr>
+            </w:r>
+          </w:p>
+        </w:tc>
+        <w:tc>
+          <w:tcPr>
+            <w:tcBorders>
+              <w:top w:color="cbd5e1" w:space="0" w:sz="4" w:val="single"/>
+              <w:left w:color="cbd5e1" w:space="0" w:sz="4" w:val="single"/>
+              <w:bottom w:color="cbd5e1" w:space="0" w:sz="4" w:val="single"/>
+              <w:right w:color="cbd5e1" w:space="0" w:sz="4" w:val="single"/>
+            </w:tcBorders>
+            <w:shd w:fill="f8fafc" w:val="clear"/>
             <w:tcMar>
               <w:top w:w="80.0" w:type="dxa"/>
               <w:left w:w="120.0" w:type="dxa"/>
@@ -3291,6 +4002,199 @@
                 <w:rtl w:val="0"/>
               </w:rPr>
               <w:t xml:space="preserve">BLOCKED</w:t>
+            </w:r>
+            <w:r>
+              <w:rPr>
+                <w:rtl w:val="0"/>
+              </w:rPr>
+            </w:r>
+          </w:p>
+        </w:tc>
+      </w:tr>
+      <w:tr>
+        <w:trPr>
+          <w:cantSplit w:val="0"/>
+          <w:tblHeader w:val="0"/>
+        </w:trPr>
+        <w:tc>
+          <w:tcPr>
+            <w:tcBorders>
+              <w:top w:color="cbd5e1" w:space="0" w:sz="4" w:val="single"/>
+              <w:left w:color="cbd5e1" w:space="0" w:sz="4" w:val="single"/>
+              <w:bottom w:color="cbd5e1" w:space="0" w:sz="4" w:val="single"/>
+              <w:right w:color="cbd5e1" w:space="0" w:sz="4" w:val="single"/>
+            </w:tcBorders>
+            <w:tcMar>
+              <w:top w:w="80.0" w:type="dxa"/>
+              <w:left w:w="120.0" w:type="dxa"/>
+              <w:bottom w:w="80.0" w:type="dxa"/>
+              <w:right w:w="120.0" w:type="dxa"/>
+            </w:tcMar>
+          </w:tcPr>
+          <w:p>
+            <w:pPr>
+              <w:spacing w:line="280" w:lineRule="auto"/>
+              <w:rPr/>
+            </w:pPr>
+            <w:r>
+              <w:rPr>
+                <w:rFonts w:ascii="Arial" w:cs="Arial" w:eastAsia="Arial" w:hAnsi="Arial"/>
+                <w:color w:val="334155"/>
+                <w:sz w:val="20"/>
+                <w:szCs w:val="20"/>
+                <w:rtl w:val="0"/>
+              </w:rPr>
+              <w:t xml:space="preserve">7</w:t>
+            </w:r>
+            <w:r>
+              <w:rPr>
+                <w:rtl w:val="0"/>
+              </w:rPr>
+            </w:r>
+          </w:p>
+        </w:tc>
+        <w:tc>
+          <w:tcPr>
+            <w:tcBorders>
+              <w:top w:color="cbd5e1" w:space="0" w:sz="4" w:val="single"/>
+              <w:left w:color="cbd5e1" w:space="0" w:sz="4" w:val="single"/>
+              <w:bottom w:color="cbd5e1" w:space="0" w:sz="4" w:val="single"/>
+              <w:right w:color="cbd5e1" w:space="0" w:sz="4" w:val="single"/>
+            </w:tcBorders>
+            <w:tcMar>
+              <w:top w:w="80.0" w:type="dxa"/>
+              <w:left w:w="120.0" w:type="dxa"/>
+              <w:bottom w:w="80.0" w:type="dxa"/>
+              <w:right w:w="120.0" w:type="dxa"/>
+            </w:tcMar>
+          </w:tcPr>
+          <w:p>
+            <w:pPr>
+              <w:spacing w:line="280" w:lineRule="auto"/>
+              <w:rPr/>
+            </w:pPr>
+            <w:r>
+              <w:rPr>
+                <w:rFonts w:ascii="Arial" w:cs="Arial" w:eastAsia="Arial" w:hAnsi="Arial"/>
+                <w:color w:val="334155"/>
+                <w:sz w:val="20"/>
+                <w:szCs w:val="20"/>
+                <w:rtl w:val="0"/>
+              </w:rPr>
+              <w:t xml:space="preserve">Internal: get CEO approval for 10% discount (multi-module + PoC conversion + negotiated)</w:t>
+            </w:r>
+            <w:r>
+              <w:rPr>
+                <w:rtl w:val="0"/>
+              </w:rPr>
+            </w:r>
+          </w:p>
+        </w:tc>
+        <w:tc>
+          <w:tcPr>
+            <w:tcBorders>
+              <w:top w:color="cbd5e1" w:space="0" w:sz="4" w:val="single"/>
+              <w:left w:color="cbd5e1" w:space="0" w:sz="4" w:val="single"/>
+              <w:bottom w:color="cbd5e1" w:space="0" w:sz="4" w:val="single"/>
+              <w:right w:color="cbd5e1" w:space="0" w:sz="4" w:val="single"/>
+            </w:tcBorders>
+            <w:tcMar>
+              <w:top w:w="80.0" w:type="dxa"/>
+              <w:left w:w="120.0" w:type="dxa"/>
+              <w:bottom w:w="80.0" w:type="dxa"/>
+              <w:right w:w="120.0" w:type="dxa"/>
+            </w:tcMar>
+          </w:tcPr>
+          <w:p>
+            <w:pPr>
+              <w:spacing w:line="280" w:lineRule="auto"/>
+              <w:rPr/>
+            </w:pPr>
+            <w:r>
+              <w:rPr>
+                <w:rFonts w:ascii="Arial" w:cs="Arial" w:eastAsia="Arial" w:hAnsi="Arial"/>
+                <w:color w:val="334155"/>
+                <w:sz w:val="20"/>
+                <w:szCs w:val="20"/>
+                <w:rtl w:val="0"/>
+              </w:rPr>
+              <w:t xml:space="preserve">Indi Bintang</w:t>
+            </w:r>
+            <w:r>
+              <w:rPr>
+                <w:rtl w:val="0"/>
+              </w:rPr>
+            </w:r>
+          </w:p>
+        </w:tc>
+        <w:tc>
+          <w:tcPr>
+            <w:tcBorders>
+              <w:top w:color="cbd5e1" w:space="0" w:sz="4" w:val="single"/>
+              <w:left w:color="cbd5e1" w:space="0" w:sz="4" w:val="single"/>
+              <w:bottom w:color="cbd5e1" w:space="0" w:sz="4" w:val="single"/>
+              <w:right w:color="cbd5e1" w:space="0" w:sz="4" w:val="single"/>
+            </w:tcBorders>
+            <w:tcMar>
+              <w:top w:w="80.0" w:type="dxa"/>
+              <w:left w:w="120.0" w:type="dxa"/>
+              <w:bottom w:w="80.0" w:type="dxa"/>
+              <w:right w:w="120.0" w:type="dxa"/>
+            </w:tcMar>
+          </w:tcPr>
+          <w:p>
+            <w:pPr>
+              <w:spacing w:line="280" w:lineRule="auto"/>
+              <w:rPr/>
+            </w:pPr>
+            <w:r>
+              <w:rPr>
+                <w:rFonts w:ascii="Arial" w:cs="Arial" w:eastAsia="Arial" w:hAnsi="Arial"/>
+                <w:color w:val="334155"/>
+                <w:sz w:val="20"/>
+                <w:szCs w:val="20"/>
+                <w:rtl w:val="0"/>
+              </w:rPr>
+              <w:t xml:space="preserve">ASAP</w:t>
+            </w:r>
+            <w:r>
+              <w:rPr>
+                <w:rtl w:val="0"/>
+              </w:rPr>
+            </w:r>
+          </w:p>
+        </w:tc>
+        <w:tc>
+          <w:tcPr>
+            <w:tcBorders>
+              <w:top w:color="cbd5e1" w:space="0" w:sz="4" w:val="single"/>
+              <w:left w:color="cbd5e1" w:space="0" w:sz="4" w:val="single"/>
+              <w:bottom w:color="cbd5e1" w:space="0" w:sz="4" w:val="single"/>
+              <w:right w:color="cbd5e1" w:space="0" w:sz="4" w:val="single"/>
+            </w:tcBorders>
+            <w:tcMar>
+              <w:top w:w="80.0" w:type="dxa"/>
+              <w:left w:w="120.0" w:type="dxa"/>
+              <w:bottom w:w="80.0" w:type="dxa"/>
+              <w:right w:w="120.0" w:type="dxa"/>
+            </w:tcMar>
+          </w:tcPr>
+          <w:p>
+            <w:pPr>
+              <w:spacing w:line="280" w:lineRule="auto"/>
+              <w:rPr/>
+            </w:pPr>
+            <w:r>
+              <w:rPr>
+                <w:rFonts w:ascii="Arial" w:cs="Arial" w:eastAsia="Arial" w:hAnsi="Arial"/>
+                <w:b w:val="1"/>
+                <w:bCs w:val="1"/>
+                <w:color w:val="dc2626"/>
+                <w:sz w:val="20"/>
+                <w:szCs w:val="20"/>
+                <w:rtl w:val="0"/>
+              </w:rPr>
+              <w:t xml:space="preserve">URGENT</w:t>
             </w:r>
             <w:r>
               <w:rPr>
@@ -3503,6 +4407,7 @@
             </w:pPr>
             <w:r>
               <w:rPr>
+                <w:rFonts w:ascii="Arial" w:cs="Arial" w:eastAsia="Arial" w:hAnsi="Arial"/>
                 <w:b w:val="1"/>
                 <w:bCs w:val="1"/>
                 <w:color w:val="334155"/>
@@ -3510,19 +4415,7 @@
                 <w:szCs w:val="20"/>
                 <w:rtl w:val="0"/>
               </w:rPr>
-              <w:t xml:space="preserve">Yoni </w:t>
-            </w:r>
-            <w:r>
-              <w:rPr>
-                <w:rFonts w:ascii="Arial" w:cs="Arial" w:eastAsia="Arial" w:hAnsi="Arial"/>
-                <w:b w:val="1"/>
-                <w:bCs w:val="1"/>
-                <w:color w:val="334155"/>
-                <w:sz w:val="20"/>
-                <w:szCs w:val="20"/>
-                <w:rtl w:val="0"/>
-              </w:rPr>
-              <w:t xml:space="preserve"> Hartono</w:t>
+              <w:t xml:space="preserve">Yoni Hartono</w:t>
             </w:r>
             <w:r>
               <w:rPr>
@@ -3596,7 +4489,7 @@
                 <w:szCs w:val="20"/>
                 <w:rtl w:val="0"/>
               </w:rPr>
-              <w:t xml:space="preserve">Primary contact. Operationally supportive. Attended PoC review. Needs VP sign-off for budget.</w:t>
+              <w:t xml:space="preserve">Primary contact. Operationally supportive. Confirmed intent to proceed. Requested 10% discount on behalf of procurement. Will present proposal to VP.</w:t>
             </w:r>
             <w:r>
               <w:rPr>
@@ -3718,26 +4611,126 @@
                 <w:szCs w:val="20"/>
                 <w:rtl w:val="0"/>
               </w:rPr>
-              <w:t xml:space="preserve">Has not been met. Needs executive summary + ROI projection. </w:t>
-            </w:r>
-            <w:r>
-              <w:rPr>
-                <w:color w:val="334155"/>
-                <w:sz w:val="20"/>
-                <w:szCs w:val="20"/>
-                <w:rtl w:val="0"/>
-              </w:rPr>
-              <w:t xml:space="preserve">Yoni </w:t>
-            </w:r>
-            <w:r>
-              <w:rPr>
-                <w:rFonts w:ascii="Arial" w:cs="Arial" w:eastAsia="Arial" w:hAnsi="Arial"/>
-                <w:color w:val="334155"/>
-                <w:sz w:val="20"/>
-                <w:szCs w:val="20"/>
-                <w:rtl w:val="0"/>
-              </w:rPr>
-              <w:t xml:space="preserve"> will present internally on our behalf.</w:t>
+              <w:t xml:space="preserve">Has not been met directly. Reviewed PoC results internally (positive). Needs executive summary + ROI projection + updated quotation to approve budget.</w:t>
+            </w:r>
+            <w:r>
+              <w:rPr>
+                <w:rtl w:val="0"/>
+              </w:rPr>
+            </w:r>
+          </w:p>
+        </w:tc>
+      </w:tr>
+      <w:tr>
+        <w:trPr>
+          <w:cantSplit w:val="0"/>
+          <w:tblHeader w:val="0"/>
+        </w:trPr>
+        <w:tc>
+          <w:tcPr>
+            <w:tcBorders>
+              <w:top w:color="cbd5e1" w:space="0" w:sz="4" w:val="single"/>
+              <w:left w:color="cbd5e1" w:space="0" w:sz="4" w:val="single"/>
+              <w:bottom w:color="cbd5e1" w:space="0" w:sz="4" w:val="single"/>
+              <w:right w:color="cbd5e1" w:space="0" w:sz="4" w:val="single"/>
+            </w:tcBorders>
+            <w:tcMar>
+              <w:top w:w="80.0" w:type="dxa"/>
+              <w:left w:w="120.0" w:type="dxa"/>
+              <w:bottom w:w="80.0" w:type="dxa"/>
+              <w:right w:w="120.0" w:type="dxa"/>
+            </w:tcMar>
+          </w:tcPr>
+          <w:p>
+            <w:pPr>
+              <w:spacing w:line="280" w:lineRule="auto"/>
+              <w:rPr/>
+            </w:pPr>
+            <w:r>
+              <w:rPr>
+                <w:rFonts w:ascii="Arial" w:cs="Arial" w:eastAsia="Arial" w:hAnsi="Arial"/>
+                <w:b w:val="1"/>
+                <w:bCs w:val="1"/>
+                <w:color w:val="334155"/>
+                <w:sz w:val="20"/>
+                <w:szCs w:val="20"/>
+                <w:rtl w:val="0"/>
+              </w:rPr>
+              <w:t xml:space="preserve">Procurement Team</w:t>
+            </w:r>
+            <w:r>
+              <w:rPr>
+                <w:rtl w:val="0"/>
+              </w:rPr>
+            </w:r>
+          </w:p>
+        </w:tc>
+        <w:tc>
+          <w:tcPr>
+            <w:tcBorders>
+              <w:top w:color="cbd5e1" w:space="0" w:sz="4" w:val="single"/>
+              <w:left w:color="cbd5e1" w:space="0" w:sz="4" w:val="single"/>
+              <w:bottom w:color="cbd5e1" w:space="0" w:sz="4" w:val="single"/>
+              <w:right w:color="cbd5e1" w:space="0" w:sz="4" w:val="single"/>
+            </w:tcBorders>
+            <w:tcMar>
+              <w:top w:w="80.0" w:type="dxa"/>
+              <w:left w:w="120.0" w:type="dxa"/>
+              <w:bottom w:w="80.0" w:type="dxa"/>
+              <w:right w:w="120.0" w:type="dxa"/>
+            </w:tcMar>
+          </w:tcPr>
+          <w:p>
+            <w:pPr>
+              <w:spacing w:line="280" w:lineRule="auto"/>
+              <w:rPr/>
+            </w:pPr>
+            <w:r>
+              <w:rPr>
+                <w:rFonts w:ascii="Arial" w:cs="Arial" w:eastAsia="Arial" w:hAnsi="Arial"/>
+                <w:color w:val="334155"/>
+                <w:sz w:val="20"/>
+                <w:szCs w:val="20"/>
+                <w:rtl w:val="0"/>
+              </w:rPr>
+              <w:t xml:space="preserve">Commercial Gatekeeper</w:t>
+            </w:r>
+            <w:r>
+              <w:rPr>
+                <w:rtl w:val="0"/>
+              </w:rPr>
+            </w:r>
+          </w:p>
+        </w:tc>
+        <w:tc>
+          <w:tcPr>
+            <w:tcBorders>
+              <w:top w:color="cbd5e1" w:space="0" w:sz="4" w:val="single"/>
+              <w:left w:color="cbd5e1" w:space="0" w:sz="4" w:val="single"/>
+              <w:bottom w:color="cbd5e1" w:space="0" w:sz="4" w:val="single"/>
+              <w:right w:color="cbd5e1" w:space="0" w:sz="4" w:val="single"/>
+            </w:tcBorders>
+            <w:tcMar>
+              <w:top w:w="80.0" w:type="dxa"/>
+              <w:left w:w="120.0" w:type="dxa"/>
+              <w:bottom w:w="80.0" w:type="dxa"/>
+              <w:right w:w="120.0" w:type="dxa"/>
+            </w:tcMar>
+          </w:tcPr>
+          <w:p>
+            <w:pPr>
+              <w:spacing w:line="280" w:lineRule="auto"/>
+              <w:rPr/>
+            </w:pPr>
+            <w:r>
+              <w:rPr>
+                <w:rFonts w:ascii="Arial" w:cs="Arial" w:eastAsia="Arial" w:hAnsi="Arial"/>
+                <w:color w:val="334155"/>
+                <w:sz w:val="20"/>
+                <w:szCs w:val="20"/>
+                <w:rtl w:val="0"/>
+              </w:rPr>
+              <w:t xml:space="preserve">Driving the 10% discount request. Standard practice for agreements of this scope. Need formal quotation with discount reflected.</w:t>
             </w:r>
             <w:r>
               <w:rPr>
@@ -3787,7 +4780,7 @@
           <w:szCs w:val="22"/>
           <w:rtl w:val="0"/>
         </w:rPr>
-        <w:t xml:space="preserve">The following fields should be updated in Monday.com (Deal: Sentosa Health Insurance):</w:t>
+        <w:t xml:space="preserve">Update Monday.com (Deal: Sentosa Health Insurance — STP):</w:t>
       </w:r>
       <w:r>
         <w:rPr>
@@ -4404,7 +5397,7 @@
                 <w:szCs w:val="20"/>
                 <w:rtl w:val="0"/>
               </w:rPr>
-              <w:t xml:space="preserve">Send commercial proposal + executive summary by May 1</w:t>
+              <w:t xml:space="preserve">Send updated quotation (10% discount) + revised proposal by May 1</w:t>
             </w:r>
             <w:r>
               <w:rPr>
@@ -4486,7 +5479,91 @@
                 <w:szCs w:val="20"/>
                 <w:rtl w:val="0"/>
               </w:rPr>
-              <w:t xml:space="preserve">VP of Operations sign-off required. Waiting on sample forms for OCR fine-tuning.</w:t>
+              <w:t xml:space="preserve">VP of Operations sign-off required. Awaiting sample forms for OCR tuning.</w:t>
+            </w:r>
+            <w:r>
+              <w:rPr>
+                <w:rtl w:val="0"/>
+              </w:rPr>
+            </w:r>
+          </w:p>
+        </w:tc>
+      </w:tr>
+      <w:tr>
+        <w:trPr>
+          <w:cantSplit w:val="0"/>
+          <w:tblHeader w:val="0"/>
+        </w:trPr>
+        <w:tc>
+          <w:tcPr>
+            <w:tcBorders>
+              <w:top w:color="cbd5e1" w:space="0" w:sz="4" w:val="single"/>
+              <w:left w:color="cbd5e1" w:space="0" w:sz="4" w:val="single"/>
+              <w:bottom w:color="cbd5e1" w:space="0" w:sz="4" w:val="single"/>
+              <w:right w:color="cbd5e1" w:space="0" w:sz="4" w:val="single"/>
+            </w:tcBorders>
+            <w:shd w:fill="f8fafc" w:val="clear"/>
+            <w:tcMar>
+              <w:top w:w="80.0" w:type="dxa"/>
+              <w:left w:w="120.0" w:type="dxa"/>
+              <w:bottom w:w="80.0" w:type="dxa"/>
+              <w:right w:w="120.0" w:type="dxa"/>
+            </w:tcMar>
+          </w:tcPr>
+          <w:p>
+            <w:pPr>
+              <w:spacing w:line="280" w:lineRule="auto"/>
+              <w:rPr/>
+            </w:pPr>
+            <w:r>
+              <w:rPr>
+                <w:rFonts w:ascii="Arial" w:cs="Arial" w:eastAsia="Arial" w:hAnsi="Arial"/>
+                <w:b w:val="1"/>
+                <w:bCs w:val="1"/>
+                <w:color w:val="334155"/>
+                <w:sz w:val="20"/>
+                <w:szCs w:val="20"/>
+                <w:rtl w:val="0"/>
+              </w:rPr>
+              <w:t xml:space="preserve">Deal Notes</w:t>
+            </w:r>
+            <w:r>
+              <w:rPr>
+                <w:rtl w:val="0"/>
+              </w:rPr>
+            </w:r>
+          </w:p>
+        </w:tc>
+        <w:tc>
+          <w:tcPr>
+            <w:tcBorders>
+              <w:top w:color="cbd5e1" w:space="0" w:sz="4" w:val="single"/>
+              <w:left w:color="cbd5e1" w:space="0" w:sz="4" w:val="single"/>
+              <w:bottom w:color="cbd5e1" w:space="0" w:sz="4" w:val="single"/>
+              <w:right w:color="cbd5e1" w:space="0" w:sz="4" w:val="single"/>
+            </w:tcBorders>
+            <w:shd w:fill="f8fafc" w:val="clear"/>
+            <w:tcMar>
+              <w:top w:w="80.0" w:type="dxa"/>
+              <w:left w:w="120.0" w:type="dxa"/>
+              <w:bottom w:w="80.0" w:type="dxa"/>
+              <w:right w:w="120.0" w:type="dxa"/>
+            </w:tcMar>
+          </w:tcPr>
+          <w:p>
+            <w:pPr>
+              <w:spacing w:line="280" w:lineRule="auto"/>
+              <w:rPr/>
+            </w:pPr>
+            <w:r>
+              <w:rPr>
+                <w:rFonts w:ascii="Arial" w:cs="Arial" w:eastAsia="Arial" w:hAnsi="Arial"/>
+                <w:color w:val="334155"/>
+                <w:sz w:val="20"/>
+                <w:szCs w:val="20"/>
+                <w:rtl w:val="0"/>
+              </w:rPr>
+              <w:t xml:space="preserve">Client confirmed intent to proceed. 10% discount requested by procurement. Need CEO approval for discount (multi-module + PoC conversion + negotiated = 10%).</w:t>
             </w:r>
             <w:r>
               <w:rPr>

</xml_diff>